<commit_message>
Fix consistency issues found in final audit
Exhibit 4 totals (Results text corrected to match table row-sums):
- 3,773,401 → 3,773,268 additional identified
- 252,817   → 252,799   coverage losses averted
- FL 668,328/44,778 → 667,666/44,733
- TX 39,296 → 39,295  |  CA 555,678 → 555,676

Appendix table of contents: added A.5, A.6, B.6 (added in revision)
Appendix B.1: formal 'eTable B1' label added to simulation parameters table
All downstream copies (has_revision/, docx files) regenerated and synced.

Co-Authored-By: Claude Sonnet 4.6 <noreply@anthropic.com>
</commit_message>
<xml_diff>
--- a/has_revision/manuscript_tracked_changes.docx
+++ b/has_revision/manuscript_tracked_changes.docx
@@ -795,7 +795,7 @@
       <w:pPr>
         <w:pStyle w:val="Heading3"/>
       </w:pPr>
-      <w:ins w:id="1040" w:author="Basu/Berkowitz" w:date="2026-04-12T00:00:00Z">
+      <w:ins w:id="1052" w:author="Basu/Berkowitz" w:date="2026-04-12T00:00:00Z">
         <w:r>
           <w:t xml:space="preserve">Limitations</w:t>
         </w:r>
@@ -805,47 +805,47 @@
       <w:pPr>
         <w:pStyle w:val="FirstParagraph"/>
       </w:pPr>
-      <w:ins w:id="1041" w:author="Basu/Berkowitz" w:date="2026-04-12T00:00:00Z">
+      <w:ins w:id="1053" w:author="Basu/Berkowitz" w:date="2026-04-12T00:00:00Z">
         <w:r>
           <w:t xml:space="preserve">Five limitations merit discussion. First, the ACS PUMS disability measure is self-reported and broader than state-specific ADL-based frailty criteria, meaning simulated sensitivity may overstate the under-identification gap relative to state-defined frailty. Second, the microsimulation relies on published estimates of race-differential detection and documentation probabilities; individual-level claims-linked disability data (available through ResDAC-restricted T-MSIS TAF files) would enable direct validation. Third, the proportional gap closure parameter (40%) is based on published evidence on HIE benefits;</w:t>
         </w:r>
       </w:ins>
-      <w:ins w:id="1042" w:author="Basu/Berkowitz" w:date="2026-04-12T00:00:00Z">
+      <w:ins w:id="1054" w:author="Basu/Berkowitz" w:date="2026-04-12T00:00:00Z">
         <w:r>
           <w:t xml:space="preserve">12,13</w:t>
         </w:r>
       </w:ins>
-      <w:ins w:id="1043" w:author="Basu/Berkowitz" w:date="2026-04-12T00:00:00Z">
+      <w:ins w:id="1055" w:author="Basu/Berkowitz" w:date="2026-04-12T00:00:00Z">
         <w:r>
           <w:t xml:space="preserve"> </w:t>
         </w:r>
       </w:ins>
-      <w:ins w:id="1044" w:author="Basu/Berkowitz" w:date="2026-04-12T00:00:00Z">
+      <w:ins w:id="1056" w:author="Basu/Berkowitz" w:date="2026-04-12T00:00:00Z">
         <w:r>
           <w:t xml:space="preserve">states with different health IT infrastructure may achieve different magnitudes of improvement. Fourth, the redesigned algorithm represents a composite of existing best practices, not a randomized intervention; projected gains assume that combining features from multiple states produces additive benefits. As partial external validation, we analyzed G2211 (</w:t>
         </w:r>
       </w:ins>
-      <w:ins w:id="1045" w:author="Basu/Berkowitz" w:date="2026-04-12T00:00:00Z">
+      <w:ins w:id="1057" w:author="Basu/Berkowitz" w:date="2026-04-12T00:00:00Z">
         <w:r>
           <w:t xml:space="preserve">“visit complexity inherent to E&amp;M”</w:t>
         </w:r>
       </w:ins>
-      <w:ins w:id="1046" w:author="Basu/Berkowitz" w:date="2026-04-12T00:00:00Z">
+      <w:ins w:id="1058" w:author="Basu/Berkowitz" w:date="2026-04-12T00:00:00Z">
         <w:r>
           <w:t xml:space="preserve">) billing data from the same HHS dataset; among 8,195 unique G2211-billing providers and 3.7 million claims, providers in specialties corresponding to the redesigned algorithm’s 13 ICD-10 families (plus primary care) accounted for 52.6% of G2211 volume, with the highest specialist domains being genitourinary (3.9%), behavioral health (2.3%), cardiovascular (2.1%), and musculoskeletal (2.1%) — all included in the redesigned list (eAppendix D).</w:t>
         </w:r>
       </w:ins>
-      <w:ins w:id="1047" w:author="Basu/Berkowitz" w:date="2026-04-12T00:00:00Z">
+      <w:ins w:id="1059" w:author="Basu/Berkowitz" w:date="2026-04-12T00:00:00Z">
         <w:r>
           <w:t xml:space="preserve">25,29</w:t>
         </w:r>
       </w:ins>
-      <w:ins w:id="1048" w:author="Basu/Berkowitz" w:date="2026-04-12T00:00:00Z">
+      <w:ins w:id="1060" w:author="Basu/Berkowitz" w:date="2026-04-12T00:00:00Z">
         <w:r>
           <w:t xml:space="preserve"> </w:t>
         </w:r>
       </w:ins>
-      <w:ins w:id="1049" w:author="Basu/Berkowitz" w:date="2026-04-12T00:00:00Z">
+      <w:ins w:id="1061" w:author="Basu/Berkowitz" w:date="2026-04-12T00:00:00Z">
         <w:r>
           <w:t xml:space="preserve">Fifth, coverage loss projections apply the Arkansas 2018 disenrollment rate as a national benchmark, which may not generalize to states with different enforcement approaches.</w:t>
         </w:r>
@@ -987,7 +987,85 @@
         <w:pStyle w:val="FirstParagraph"/>
       </w:pPr>
       <w:r>
-        <w:t xml:space="preserve">Adoption of the redesigned algorithm would identify an estimated 3,773,401 additional medically frail adults across 17 states, averting an estimated 252,817 coverage losses under full community engagement requirement enforcement (Exhibit 4). The largest absolute impact was projected in Florida (668,328 additional identified; 44,778 losses averted), Texas (586,500; 39,296), and California (555,678; 37,230). Even states with relatively inclusive existing algorithms—such as New York and Wisconsin—would gain, reflecting the expanded diagnostic recognition and data integration improvements.</w:t>
+        <w:t xml:space="preserve">Adoption of the redesigned algorithm would identify an estimated</w:t>
+      </w:r>
+      <w:del w:id="1029" w:author="Basu/Berkowitz" w:date="2026-04-12T00:00:00Z">
+        <w:r>
+          <w:delText>3,773,401</w:delText>
+        </w:r>
+      </w:del>
+      <w:ins w:id="1030" w:author="Basu/Berkowitz" w:date="2026-04-12T00:00:00Z">
+        <w:r>
+          <w:t>3,773,268</w:t>
+        </w:r>
+      </w:ins>
+      <w:r>
+        <w:t xml:space="preserve">additional medically frail adults across 17 states, averting an estimated</w:t>
+      </w:r>
+      <w:del w:id="1031" w:author="Basu/Berkowitz" w:date="2026-04-12T00:00:00Z">
+        <w:r>
+          <w:delText>252,817</w:delText>
+        </w:r>
+      </w:del>
+      <w:ins w:id="1032" w:author="Basu/Berkowitz" w:date="2026-04-12T00:00:00Z">
+        <w:r>
+          <w:t>252,799</w:t>
+        </w:r>
+      </w:ins>
+      <w:r>
+        <w:t xml:space="preserve">coverage losses under full community engagement requirement enforcement (Exhibit 4). The largest absolute impact was projected in Florida</w:t>
+      </w:r>
+      <w:del w:id="1033" w:author="Basu/Berkowitz" w:date="2026-04-12T00:00:00Z">
+        <w:r>
+          <w:delText>(668,328</w:delText>
+        </w:r>
+      </w:del>
+      <w:ins w:id="1034" w:author="Basu/Berkowitz" w:date="2026-04-12T00:00:00Z">
+        <w:r>
+          <w:t>(667,666</w:t>
+        </w:r>
+      </w:ins>
+      <w:r>
+        <w:t xml:space="preserve">additional identified;</w:t>
+      </w:r>
+      <w:del w:id="1035" w:author="Basu/Berkowitz" w:date="2026-04-12T00:00:00Z">
+        <w:r>
+          <w:delText>44,778</w:delText>
+        </w:r>
+      </w:del>
+      <w:ins w:id="1036" w:author="Basu/Berkowitz" w:date="2026-04-12T00:00:00Z">
+        <w:r>
+          <w:t>44,733</w:t>
+        </w:r>
+      </w:ins>
+      <w:r>
+        <w:t xml:space="preserve">losses averted), Texas (586,500;</w:t>
+      </w:r>
+      <w:del w:id="1037" w:author="Basu/Berkowitz" w:date="2026-04-12T00:00:00Z">
+        <w:r>
+          <w:delText>39,296),</w:delText>
+        </w:r>
+      </w:del>
+      <w:ins w:id="1038" w:author="Basu/Berkowitz" w:date="2026-04-12T00:00:00Z">
+        <w:r>
+          <w:t>39,295),</w:t>
+        </w:r>
+      </w:ins>
+      <w:r>
+        <w:t xml:space="preserve">and California</w:t>
+      </w:r>
+      <w:del w:id="1039" w:author="Basu/Berkowitz" w:date="2026-04-12T00:00:00Z">
+        <w:r>
+          <w:delText>(555,678;</w:delText>
+        </w:r>
+      </w:del>
+      <w:ins w:id="1040" w:author="Basu/Berkowitz" w:date="2026-04-12T00:00:00Z">
+        <w:r>
+          <w:t>(555,676;</w:t>
+        </w:r>
+      </w:ins>
+      <w:r>
+        <w:t xml:space="preserve">37,230). Even states with relatively inclusive existing algorithms—such as New York and Wisconsin—would gain, reflecting the expanded diagnostic recognition and data integration improvements.</w:t>
       </w:r>
     </w:p>
     <w:p>
@@ -1024,12 +1102,12 @@
       <w:r>
         <w:t xml:space="preserve">Existing Medicaid frailty algorithms identify fewer than one-third of adults with functional disability as medically frail, with mean sensitivity of 31.4% across 17 state algorithms. An evidence-based redesigned algorithm incorporating expanded diagnostic criteria, health information exchange integration, ex parte determination, and elimination of physician certification increased mean sensitivity to 45.6% (+14.3 percentage points). The redesigned algorithm halved the AIAN-White identification gap and modestly narrowed the Black-White</w:t>
       </w:r>
-      <w:del w:id="1029" w:author="Basu/Berkowitz" w:date="2026-04-12T00:00:00Z">
+      <w:del w:id="1041" w:author="Basu/Berkowitz" w:date="2026-04-12T00:00:00Z">
         <w:r>
           <w:delText>gap, though within-race</w:delText>
         </w:r>
       </w:del>
-      <w:ins w:id="1030" w:author="Basu/Berkowitz" w:date="2026-04-12T00:00:00Z">
+      <w:ins w:id="1042" w:author="Basu/Berkowitz" w:date="2026-04-12T00:00:00Z">
         <w:r>
           <w:t>gap. Within-race</w:t>
         </w:r>
@@ -1037,12 +1115,12 @@
       <w:r>
         <w:t xml:space="preserve">rural-urban differences</w:t>
       </w:r>
-      <w:del w:id="1031" w:author="Basu/Berkowitz" w:date="2026-04-12T00:00:00Z">
+      <w:del w:id="1043" w:author="Basu/Berkowitz" w:date="2026-04-12T00:00:00Z">
         <w:r>
           <w:delText>persisted.</w:delText>
         </w:r>
       </w:del>
-      <w:ins w:id="1032" w:author="Basu/Berkowitz" w:date="2026-04-12T00:00:00Z">
+      <w:ins w:id="1044" w:author="Basu/Berkowitz" w:date="2026-04-12T00:00:00Z">
         <w:r>
           <w:t>persisted, but in a context of increased sensitivity for all categories such that there would be absolute improvements for all categories were the new algorithm to be implemented.</w:t>
         </w:r>
@@ -1088,12 +1166,12 @@
       <w:r>
         <w:t xml:space="preserve">The heterogeneous equity effects reflect how algorithmic redesign interacts with different structural barriers. The large AIAN-White gap reduction (46%) occurs because AIAN populations, with the lowest baseline detection probability (0.52), had the most room for proportional improvement when data fragmentation between IHS and state Medicaid systems is addressed. The modest Black-White gap reduction (10%) reflects that while Black enrollees gained more in absolute terms (+15.6 versus +14.3 percentage points for White), the expanded diagnostic criteria and lowered ADL threshold—which</w:t>
       </w:r>
-      <w:del w:id="1033" w:author="Basu/Berkowitz" w:date="2026-04-12T00:00:00Z">
+      <w:del w:id="1045" w:author="Basu/Berkowitz" w:date="2026-04-12T00:00:00Z">
         <w:r>
           <w:delText>are race-neutral—contributed</w:delText>
         </w:r>
       </w:del>
-      <w:ins w:id="1034" w:author="Basu/Berkowitz" w:date="2026-04-12T00:00:00Z">
+      <w:ins w:id="1046" w:author="Basu/Berkowitz" w:date="2026-04-12T00:00:00Z">
         <w:r>
           <w:t>have similar impacts across racial categories—contributed</w:t>
         </w:r>
@@ -1154,12 +1232,12 @@
       <w:r>
         <w:t xml:space="preserve">Three implications follow. First, CMS retains authority under 42 C.F.R. § 430.25 and Public Law 119-21 rulemaking provisions to establish minimum algorithmic design standards for state frailty determination</w:t>
       </w:r>
-      <w:del w:id="1035" w:author="Basu/Berkowitz" w:date="2026-04-12T00:00:00Z">
+      <w:del w:id="1047" w:author="Basu/Berkowitz" w:date="2026-04-12T00:00:00Z">
         <w:r>
           <w:delText>systems, including minimum diagnostic breadth and data integration requirements.</w:delText>
         </w:r>
       </w:del>
-      <w:ins w:id="1036" w:author="Basu/Berkowitz" w:date="2026-04-12T00:00:00Z">
+      <w:ins w:id="1048" w:author="Basu/Berkowitz" w:date="2026-04-12T00:00:00Z">
         <w:r>
           <w:t>systems.3</w:t>
         </w:r>
@@ -1167,7 +1245,7 @@
       <w:r>
         <w:t xml:space="preserve">The difference between the least and most inclusive existing algorithms represents a 30 percentage point gap in identification sensitivity.</w:t>
       </w:r>
-      <w:ins w:id="1037" w:author="Basu/Berkowitz" w:date="2026-04-12T00:00:00Z">
+      <w:ins w:id="1049" w:author="Basu/Berkowitz" w:date="2026-04-12T00:00:00Z">
         <w:r>
           <w:t>Specific minimum standards should include: (1) recognition of at least 10 ICD-10 diagnostic condition families (the current range spans 5–13 across states); (2) mandatory health information exchange integration to supplement MMIS claims data; (3) full ex parte determination capability—automated screening without requiring individual application—to reduce procedural barriers; (4) claims adjudication lag under 3 months; and (5) elimination of physician certification requirements in favor of claims-based identification, consistent with current practice in Arkansas, Indiana, New York, California, Michigan, and Wisconsin.</w:t>
         </w:r>
@@ -1175,12 +1253,12 @@
       <w:r>
         <w:t xml:space="preserve">Second, HIE integration should be a minimum adequacy standard rather than an optional design feature: states with HIE integration achieved substantially higher sensitivity even before algorithmic redesign. Third, physician certification requirements should be eliminated in favor of data-driven ex parte determination, consistent with practice in six states, to remove a documentation barrier that disproportionately affects enrollees in communities with lower provider density. Supporting evidence from staggered difference-in-differences and synthetic control analyses of community engagement requirement implementation is presented in eAppendix</w:t>
       </w:r>
-      <w:del w:id="1038" w:author="Basu/Berkowitz" w:date="2026-04-12T00:00:00Z">
+      <w:del w:id="1050" w:author="Basu/Berkowitz" w:date="2026-04-12T00:00:00Z">
         <w:r>
           <w:delText>C. [DELETED: Limitations / Five limitations merit discussion. First, the ACS PUMS disability measure is self-reported and broader than state-specific ADL-based frailty criteria, meaning simulated sensitivity may overstate the under-identification gap relative to state-defined frailty. Second, the microsimulation relies on published estimates of race-differential detection and documentation probabilities; individual-level claims-linked disability data (available through ResDAC-restricted T-MSIS TAF files) would enable direct validation. Third, the proportional gap closure parameter (40%) is based on published evidence on HIE benefits; states with different health IT infrastructure may achieve different magnitudes of improvement. Fourth, the redesigned algorithm represents a composite of existing best practices, not a randomized intervention; projected gains assume that combining features from multiple states produces additive benefits. As partial external validation, we analyzed G2211 ("visit complexity inherent to E&amp;M") billing data from the same HHS dataset; among 8,195 unique G2211-billing providers and 3.7 million claims, providers in specialties corresponding to the redesigned algorithm's 13 ICD-10 families (plus primary care) accounted for 52.6% of G2211 volume, with the highest specialist domains being genitourinary (3.9%), behavioral health (2.3%), cardiovascular (2.1%), and musculoskeletal (2.1%) — all included in the redesigned list (eAppendix D). Fifth, coverage loss projections apply the Arkansas 2018 disenrollment rate as a national benchmark, which may not generalize to states with different enforcement approaches.]</w:delText>
         </w:r>
       </w:del>
-      <w:ins w:id="1039" w:author="Basu/Berkowitz" w:date="2026-04-12T00:00:00Z">
+      <w:ins w:id="1051" w:author="Basu/Berkowitz" w:date="2026-04-12T00:00:00Z">
         <w:r>
           <w:t>C.29</w:t>
         </w:r>
@@ -5327,7 +5405,7 @@
           <w:numId w:val="1002"/>
         </w:numPr>
       </w:pPr>
-      <w:ins w:id="1050" w:author="Basu/Berkowitz" w:date="2026-04-12T00:00:00Z">
+      <w:ins w:id="1062" w:author="Basu/Berkowitz" w:date="2026-04-12T00:00:00Z">
         <w:r>
           <w:t xml:space="preserve">To access the appendix, click on the Details tab of the article online.</w:t>
         </w:r>
@@ -5340,17 +5418,17 @@
           <w:numId w:val="1002"/>
         </w:numPr>
       </w:pPr>
-      <w:ins w:id="1051" w:author="Basu/Berkowitz" w:date="2026-04-12T00:00:00Z">
+      <w:ins w:id="1063" w:author="Basu/Berkowitz" w:date="2026-04-12T00:00:00Z">
         <w:r>
           <w:t xml:space="preserve">Chatterjee P, Orav EJ, Marcantonio ER, et al. Measurement bias in documentation of social risk among Medicare beneficiaries.</w:t>
         </w:r>
       </w:ins>
-      <w:ins w:id="1052" w:author="Basu/Berkowitz" w:date="2026-04-12T00:00:00Z">
+      <w:ins w:id="1064" w:author="Basu/Berkowitz" w:date="2026-04-12T00:00:00Z">
         <w:r>
           <w:t xml:space="preserve"> </w:t>
         </w:r>
       </w:ins>
-      <w:ins w:id="1053" w:author="Basu/Berkowitz" w:date="2026-04-12T00:00:00Z">
+      <w:ins w:id="1065" w:author="Basu/Berkowitz" w:date="2026-04-12T00:00:00Z">
         <w:r>
           <w:rPr>
             <w:i/>
@@ -5359,12 +5437,12 @@
           <w:t xml:space="preserve">JAMA Health Forum.</w:t>
         </w:r>
       </w:ins>
-      <w:ins w:id="1054" w:author="Basu/Berkowitz" w:date="2026-04-12T00:00:00Z">
+      <w:ins w:id="1066" w:author="Basu/Berkowitz" w:date="2026-04-12T00:00:00Z">
         <w:r>
           <w:t xml:space="preserve"> </w:t>
         </w:r>
       </w:ins>
-      <w:ins w:id="1055" w:author="Basu/Berkowitz" w:date="2026-04-12T00:00:00Z">
+      <w:ins w:id="1067" w:author="Basu/Berkowitz" w:date="2026-04-12T00:00:00Z">
         <w:r>
           <w:t xml:space="preserve">2025;6(7):e251923. doi:10.1001/jamahealthforum.2025.1923</w:t>
         </w:r>

</xml_diff>